<commit_message>
docs(rating-model): say 'ou mais', not 'acima de', for the sub-18 ceiling
The K=40 for under-18s holds while the rating is *below* the ceiling, so
the players a ceiling leaves out are those at it or above — a 'greater
or equal' count. The test annex had that count right (56 at 2100 or
more, 10 at 2300 or more) but called it 'acima de', which reads as
strictly above. Harmless at 2100, where nobody sits on the line; wrong
at 2300, where one player does and 'acima de 2300' would be 9.

Every other figure in §1.1 and §1.2 re-derived from the spreadsheet on
2026-10-01, by column name, with the exact-boundary count checked at
each threshold: all unchanged.
</commit_message>
<xml_diff>
--- a/docs/anexo-testes-rascunho-2.docx
+++ b/docs/anexo-testes-rascunho-2.docx
@@ -1427,7 +1427,7 @@
             </w:pPr>
             <w:r>
               <w:rPr/>
-              <w:t>acima de 2100 estão 56 jogadores (6,5%); acima de 2300, 10 (1,2%)</w:t>
+              <w:t>56 jogadores (6,5%) têm 2100 ou mais; 10 (1,2%) têm 2300 ou mais</w:t>
             </w:r>
           </w:p>
         </w:tc>
@@ -1510,7 +1510,17 @@
       </w:r>
       <w:r>
         <w:rPr/>
-        <w:t xml:space="preserve"> da federação, contra 29 em 2200 — seria letra morta. E o teto do K=40 de sub-18 marca onde o jogador jovem deixa de receber o fator acelerado: em 2100 ficam acima dele 56 jogadores; em 2300, dez.</w:t>
+        <w:t xml:space="preserve"> da federação, contra 29 em 2200 — seria letra morta. E o teto do K=40 de sub-18 marca onde o jogador jovem deixa de receber o fator acelerado — o K=40 vale enquanto o rating está </w:t>
+      </w:r>
+      <w:r>
+        <w:rPr>
+          <w:rStyle w:val="Emphasis"/>
+        </w:rPr>
+        <w:t>abaixo</w:t>
+      </w:r>
+      <w:r>
+        <w:rPr/>
+        <w:t xml:space="preserve"> do teto, então quem está nele ou acima fica de fora: com o teto em 2100 são 56 jogadores; em 2300, dez.</w:t>
       </w:r>
     </w:p>
     <w:p>
@@ -4606,6 +4616,14 @@
     <w:qFormat/>
     <w:rPr>
       <w:rFonts w:ascii="OpenSymbol" w:hAnsi="OpenSymbol" w:eastAsia="OpenSymbol" w:cs="OpenSymbol"/>
+    </w:rPr>
+  </w:style>
+  <w:style w:type="character" w:styleId="Emphasis">
+    <w:name w:val="Emphasis"/>
+    <w:qFormat/>
+    <w:rPr>
+      <w:i/>
+      <w:iCs/>
     </w:rPr>
   </w:style>
   <w:style w:type="paragraph" w:styleId="Heading">

</xml_diff>

<commit_message>
docs(rating-model): the under-18 ceiling row counted the whole list
The §1.2 row for the under-18 K=40 ceiling gave 56 players at 2100 or
more and 10 at 2300 or more. Both figures are the whole rated list, of
any age — a row labelled sub-18 that counts everyone invites the reading
Pedro made, that 56 juniors sit at 2100+. The spreadsheet carries birth
dates, so the row can count the population the parameter acts on.

Under-18 by §5 of the normative annex — until the end of the year the
player turns 18, so born 2008 or later for the 2026 list — gives 205
rated juniors. Four are at 2100 or more; none at 2300; the strongest is
2263. So FEXERJ's 2100 ceiling withdraws K=40 from four players today,
and FIDE's 2300 would withdraw it from nobody — the same shape as the
K=10 row, where 2400 reaches a single player. Measured by two
independent readers of the file.
</commit_message>
<xml_diff>
--- a/docs/anexo-testes-rascunho-2.docx
+++ b/docs/anexo-testes-rascunho-2.docx
@@ -1427,7 +1427,37 @@
             </w:pPr>
             <w:r>
               <w:rPr/>
-              <w:t>56 jogadores (6,5%) têm 2100 ou mais; 10 (1,2%) têm 2300 ou mais</w:t>
+              <w:t xml:space="preserve">dos </w:t>
+            </w:r>
+            <w:r>
+              <w:rPr>
+                <w:rStyle w:val="Strong"/>
+              </w:rPr>
+              <w:t>205 sub-18</w:t>
+            </w:r>
+            <w:r>
+              <w:rPr/>
+              <w:t xml:space="preserve"> com rating, </w:t>
+            </w:r>
+            <w:r>
+              <w:rPr>
+                <w:rStyle w:val="Strong"/>
+              </w:rPr>
+              <w:t>4</w:t>
+            </w:r>
+            <w:r>
+              <w:rPr/>
+              <w:t xml:space="preserve"> têm 2100 ou mais; </w:t>
+            </w:r>
+            <w:r>
+              <w:rPr>
+                <w:rStyle w:val="Strong"/>
+              </w:rPr>
+              <w:t>nenhum</w:t>
+            </w:r>
+            <w:r>
+              <w:rPr/>
+              <w:t xml:space="preserve"> tem 2300 ou mais</w:t>
             </w:r>
           </w:p>
         </w:tc>
@@ -1510,7 +1540,17 @@
       </w:r>
       <w:r>
         <w:rPr/>
-        <w:t xml:space="preserve"> da federação, contra 29 em 2200 — seria letra morta. E o teto do K=40 de sub-18 marca onde o jogador jovem deixa de receber o fator acelerado — o K=40 vale enquanto o rating está </w:t>
+        <w:t xml:space="preserve"> da federação, contra 29 em 2200 — seria letra morta. E o teto do K=40 de sub-18 só alcança quem é sub-18 — pela seção 5 do Anexo Normativo, até o fim do ano em que completa 18, o que na lista de 2026 são os nascidos em 2008 ou depois: </w:t>
+      </w:r>
+      <w:r>
+        <w:rPr>
+          <w:rStyle w:val="Strong"/>
+        </w:rPr>
+        <w:t>205</w:t>
+      </w:r>
+      <w:r>
+        <w:rPr/>
+        <w:t xml:space="preserve"> deles têm rating. O K=40 vale enquanto o rating está </w:t>
       </w:r>
       <w:r>
         <w:rPr>
@@ -1520,7 +1560,27 @@
       </w:r>
       <w:r>
         <w:rPr/>
-        <w:t xml:space="preserve"> do teto, então quem está nele ou acima fica de fora: com o teto em 2100 são 56 jogadores; em 2300, dez.</w:t>
+        <w:t xml:space="preserve"> do teto, então quem está nele ou acima fica de fora. Com o teto em 2100 são </w:t>
+      </w:r>
+      <w:r>
+        <w:rPr>
+          <w:rStyle w:val="Strong"/>
+        </w:rPr>
+        <w:t>4</w:t>
+      </w:r>
+      <w:r>
+        <w:rPr/>
+        <w:t xml:space="preserve"> jovens; em 2300, </w:t>
+      </w:r>
+      <w:r>
+        <w:rPr>
+          <w:rStyle w:val="Strong"/>
+        </w:rPr>
+        <w:t>nenhum</w:t>
+      </w:r>
+      <w:r>
+        <w:rPr/>
+        <w:t xml:space="preserve"> — o maior rating sub-18 da lista é 2263, e o teto da FIDE não alcançaria ninguém.</w:t>
       </w:r>
     </w:p>
     <w:p>

</xml_diff>

<commit_message>
docs(rating-model): two figures in the test annex did not survive a recheck
Every statistic in the annex re-derived from its source on 2026-10-01 —
the spreadsheet for §1, the FIDE anchor fixture for §2, the real cycle
for §3: 23, 7 and 24 claims. Two were wrong, both inherited from draft 1.

The cycle's last tournament ends on 23/06/2026, not 07/06: the 07/06 is
one of the 22 distinct end dates, not the last one. And the formula
diverges from the table in 8 of the 13 anchor games, not 7 — six at the
400 cap (0.09 against 0.08), one at D=367 (0.11 against 0.10), one at
D=46 (0.43 against 0.44) — once the formula's delta is taken to the two
places the table publishes, which the sentence now says. The 20.36
against 19.60 and the 0.76 gap hold.

Everything else held, including the figures changed earlier today.
</commit_message>
<xml_diff>
--- a/docs/anexo-testes-rascunho-2.docx
+++ b/docs/anexo-testes-rascunho-2.docx
@@ -1778,11 +1778,11 @@
         <w:rPr>
           <w:rStyle w:val="Strong"/>
         </w:rPr>
-        <w:t>7 das 13 partidas divergem</w:t>
-      </w:r>
-      <w:r>
-        <w:rPr/>
-        <w:t>:</w:t>
+        <w:t>8 das 13 partidas divergem</w:t>
+      </w:r>
+      <w:r>
+        <w:rPr/>
+        <w:t xml:space="preserve"> quando a variação da fórmula é levada a duas casas, como a tabela publica:</w:t>
       </w:r>
     </w:p>
     <w:tbl>
@@ -2211,7 +2211,7 @@
         <w:rPr>
           <w:rStyle w:val="Strong"/>
         </w:rPr>
-        <w:t>35 torneios entre 25/01 e 07/06/2026</w:t>
+        <w:t>35 torneios entre 25/01 e 23/06/2026</w:t>
       </w:r>
       <w:r>
         <w:rPr/>

</xml_diff>